<commit_message>
Move Convergent testers dates into the narrative
Separate start/end date inputs could not preview or accept AI suggestions.
Dates now live in the testers text box, with prompts and export updated to match.

Co-authored-by: sachin.agrawal272 <sachin.agrawal272@gmail.com>
</commit_message>
<xml_diff>
--- a/templates/convergent-design-verification-report-template.docx
+++ b/templates/convergent-design-verification-report-template.docx
@@ -415,74 +415,6 @@
           <w:szCs w:val="24"/>
         </w:rPr>
         <w:t xml:space="preserve">{@testersXml}</w:t>
-      </w:r>
-    </w:p>
-    <w:p>
-      <w:pPr>
-        <w:spacing w:before="60" w:after="40" w:line="276" w:lineRule="auto"/>
-        <w:rPr>
-          <w:b/>
-          <w:sz w:val="24"/>
-          <w:szCs w:val="24"/>
-        </w:rPr>
-      </w:pPr>
-      <w:r>
-        <w:rPr>
-          <w:b/>
-          <w:sz w:val="24"/>
-          <w:szCs w:val="24"/>
-        </w:rPr>
-        <w:t>Start Date:</w:t>
-      </w:r>
-    </w:p>
-    <w:p>
-      <w:pPr>
-        <w:spacing w:before="80" w:after="40" w:line="276" w:lineRule="auto"/>
-        <w:rPr>
-          <w:sz w:val="24"/>
-          <w:szCs w:val="24"/>
-        </w:rPr>
-      </w:pPr>
-      <w:r>
-        <w:rPr>
-          <w:sz w:val="24"/>
-          <w:szCs w:val="24"/>
-        </w:rPr>
-        <w:t xml:space="preserve">{testersStartDate}</w:t>
-      </w:r>
-    </w:p>
-    <w:p>
-      <w:pPr>
-        <w:spacing w:before="60" w:after="40" w:line="276" w:lineRule="auto"/>
-        <w:rPr>
-          <w:b/>
-          <w:sz w:val="24"/>
-          <w:szCs w:val="24"/>
-        </w:rPr>
-      </w:pPr>
-      <w:r>
-        <w:rPr>
-          <w:b/>
-          <w:sz w:val="24"/>
-          <w:szCs w:val="24"/>
-        </w:rPr>
-        <w:t>End Date:</w:t>
-      </w:r>
-    </w:p>
-    <w:p>
-      <w:pPr>
-        <w:spacing w:before="80" w:after="40" w:line="276" w:lineRule="auto"/>
-        <w:rPr>
-          <w:sz w:val="24"/>
-          <w:szCs w:val="24"/>
-        </w:rPr>
-      </w:pPr>
-      <w:r>
-        <w:rPr>
-          <w:sz w:val="24"/>
-          <w:szCs w:val="24"/>
-        </w:rPr>
-        <w:t xml:space="preserve">{testersEndDate}</w:t>
       </w:r>
     </w:p>
     <w:p>

</xml_diff>

<commit_message>
Move Convergent testers dates into the narrative (#158)
Separate start/end date inputs could not preview or accept AI suggestions.
Dates now live in the testers text box, with prompts and export updated to match.

Co-authored-by: Cursor Agent <cursoragent@cursor.com>
</commit_message>
<xml_diff>
--- a/templates/convergent-design-verification-report-template.docx
+++ b/templates/convergent-design-verification-report-template.docx
@@ -415,74 +415,6 @@
           <w:szCs w:val="24"/>
         </w:rPr>
         <w:t xml:space="preserve">{@testersXml}</w:t>
-      </w:r>
-    </w:p>
-    <w:p>
-      <w:pPr>
-        <w:spacing w:before="60" w:after="40" w:line="276" w:lineRule="auto"/>
-        <w:rPr>
-          <w:b/>
-          <w:sz w:val="24"/>
-          <w:szCs w:val="24"/>
-        </w:rPr>
-      </w:pPr>
-      <w:r>
-        <w:rPr>
-          <w:b/>
-          <w:sz w:val="24"/>
-          <w:szCs w:val="24"/>
-        </w:rPr>
-        <w:t>Start Date:</w:t>
-      </w:r>
-    </w:p>
-    <w:p>
-      <w:pPr>
-        <w:spacing w:before="80" w:after="40" w:line="276" w:lineRule="auto"/>
-        <w:rPr>
-          <w:sz w:val="24"/>
-          <w:szCs w:val="24"/>
-        </w:rPr>
-      </w:pPr>
-      <w:r>
-        <w:rPr>
-          <w:sz w:val="24"/>
-          <w:szCs w:val="24"/>
-        </w:rPr>
-        <w:t xml:space="preserve">{testersStartDate}</w:t>
-      </w:r>
-    </w:p>
-    <w:p>
-      <w:pPr>
-        <w:spacing w:before="60" w:after="40" w:line="276" w:lineRule="auto"/>
-        <w:rPr>
-          <w:b/>
-          <w:sz w:val="24"/>
-          <w:szCs w:val="24"/>
-        </w:rPr>
-      </w:pPr>
-      <w:r>
-        <w:rPr>
-          <w:b/>
-          <w:sz w:val="24"/>
-          <w:szCs w:val="24"/>
-        </w:rPr>
-        <w:t>End Date:</w:t>
-      </w:r>
-    </w:p>
-    <w:p>
-      <w:pPr>
-        <w:spacing w:before="80" w:after="40" w:line="276" w:lineRule="auto"/>
-        <w:rPr>
-          <w:sz w:val="24"/>
-          <w:szCs w:val="24"/>
-        </w:rPr>
-      </w:pPr>
-      <w:r>
-        <w:rPr>
-          <w:sz w:val="24"/>
-          <w:szCs w:val="24"/>
-        </w:rPr>
-        <w:t xml:space="preserve">{testersEndDate}</w:t>
       </w:r>
     </w:p>
     <w:p>

</xml_diff>

<commit_message>
Match Convergent DV Word export to the Solea 790-00134R report.
Restore header/footer on the template and apply Arial 10pt justified body, ListParagraph bullets, and centered C6D9F1 tables so the download looks like the customer original.
</commit_message>
<xml_diff>
--- a/templates/convergent-design-verification-report-template.docx
+++ b/templates/convergent-design-verification-report-template.docx
@@ -381,7 +381,6 @@
         <w:spacing w:before="0" w:after="240"/>
         <w:jc w:val="both"/>
         <w:rPr>
-          <w:b w:val="0"/>
           <w:szCs w:val="20"/>
         </w:rPr>
       </w:pPr>
@@ -506,7 +505,6 @@
         <w:spacing w:before="0" w:after="240"/>
         <w:jc w:val="both"/>
         <w:rPr>
-          <w:b w:val="0"/>
           <w:szCs w:val="20"/>
         </w:rPr>
       </w:pPr>
@@ -1086,6 +1084,8 @@
       <w:bookmarkEnd w:id="7"/>
     </w:tbl>
     <w:sectPr>
+      <w:headerReference w:type="default" r:id="rId11"/>
+      <w:footerReference w:type="default" r:id="rId12"/>
       <w:pgSz w:w="12240" w:h="15840"/>
       <w:pgMar w:top="1440" w:right="1440" w:bottom="1440" w:left="1440" w:header="274" w:footer="360" w:gutter="0"/>
       <w:cols w:space="720"/>
@@ -1418,7 +1418,7 @@
         <w:sz w:val="20"/>
         <w:szCs w:val="20"/>
       </w:rPr>
-      <w:t xml:space="preserve">{productName} Software Design Verification Report</w:t>
+      <w:t xml:space="preserve">{productName} Software Design Verification Test Report</w:t>
     </w:r>
   </w:p>
   <w:p>

</xml_diff>